<commit_message>
docs: update Project_documentation.docx with 125 API explanations
</commit_message>
<xml_diff>
--- a/Project_documentation.docx
+++ b/Project_documentation.docx
@@ -6,8 +6,16 @@
       <w:pPr>
         <w:pStyle w:val="Title"/>
         <w:jc w:val="center"/>
+        <w:rPr>
+          <w:b/>
+          <w:bCs/>
+        </w:rPr>
       </w:pPr>
       <w:r>
+        <w:rPr>
+          <w:b/>
+          <w:bCs/>
+        </w:rPr>
         <w:t>Claim Denial Risk Prediction System</w:t>
       </w:r>
     </w:p>
@@ -866,7 +874,10 @@
         <w:pStyle w:val="Heading1"/>
       </w:pPr>
       <w:r>
-        <w:t>6. Safety &amp; Auditability</w:t>
+        <w:t xml:space="preserve">6. </w:t>
+      </w:r>
+      <w:r>
+        <w:t>Guardrails and Validations</w:t>
       </w:r>
     </w:p>
     <w:p>
@@ -1098,110 +1109,6 @@
       </w:tr>
     </w:tbl>
     <w:p/>
-    <w:p>
-      <w:pPr>
-        <w:pStyle w:val="Heading1"/>
-      </w:pPr>
-      <w:r>
-        <w:t>7. Limitations &amp; Recommendations</w:t>
-      </w:r>
-    </w:p>
-    <w:p>
-      <w:pPr>
-        <w:pStyle w:val="Heading2"/>
-      </w:pPr>
-      <w:r>
-        <w:t>Current Limitations</w:t>
-      </w:r>
-    </w:p>
-    <w:p>
-      <w:pPr>
-        <w:pStyle w:val="ListBullet"/>
-      </w:pPr>
-      <w:r>
-        <w:t>Synthetic training data: Real claims would include ICD-10/CPT codes and 835 remittance data, significantly improving prediction accuracy.</w:t>
-      </w:r>
-    </w:p>
-    <w:p>
-      <w:pPr>
-        <w:pStyle w:val="ListBullet"/>
-      </w:pPr>
-      <w:r>
-        <w:t>Single global model: Different payers have distinct denial patterns; payer-specific sub-models may improve performance.</w:t>
-      </w:r>
-    </w:p>
-    <w:p>
-      <w:pPr>
-        <w:pStyle w:val="ListBullet"/>
-      </w:pPr>
-      <w:r>
-        <w:t>Small dataset: 3,200 claims is adequate for linear models but insufficient for deep learning approaches.</w:t>
-      </w:r>
-    </w:p>
-    <w:p>
-      <w:pPr>
-        <w:pStyle w:val="ListBullet"/>
-      </w:pPr>
-      <w:r>
-        <w:t>Binary outcome only: Does not distinguish administrative denials from medical necessity or coding denials.</w:t>
-      </w:r>
-    </w:p>
-    <w:p>
-      <w:pPr>
-        <w:pStyle w:val="Heading2"/>
-      </w:pPr>
-      <w:r>
-        <w:t>Production Recommendations</w:t>
-      </w:r>
-    </w:p>
-    <w:p>
-      <w:pPr>
-        <w:pStyle w:val="ListBullet"/>
-      </w:pPr>
-      <w:r>
-        <w:t>Deploy the Calibrated Logistic Regression model immediately for the 25% review workflow.</w:t>
-      </w:r>
-    </w:p>
-    <w:p>
-      <w:pPr>
-        <w:pStyle w:val="ListBullet"/>
-      </w:pPr>
-      <w:r>
-        <w:t>Retrain monthly as new claims and denial outcomes become available.</w:t>
-      </w:r>
-    </w:p>
-    <w:p>
-      <w:pPr>
-        <w:pStyle w:val="ListBullet"/>
-      </w:pPr>
-      <w:r>
-        <w:t>Monitor Brier score as an early warning for model drift.</w:t>
-      </w:r>
-    </w:p>
-    <w:p>
-      <w:pPr>
-        <w:pStyle w:val="ListBullet"/>
-      </w:pPr>
-      <w:r>
-        <w:t>A/B test the flagged review workflow against current process to measure actual denial reduction.</w:t>
-      </w:r>
-    </w:p>
-    <w:p>
-      <w:pPr>
-        <w:pStyle w:val="ListBullet"/>
-      </w:pPr>
-      <w:r>
-        <w:t>Incorporate ICD-10/CPT code features when real claims data becomes available.</w:t>
-      </w:r>
-    </w:p>
-    <w:p>
-      <w:pPr>
-        <w:pStyle w:val="ListBullet"/>
-      </w:pPr>
-      <w:r>
-        <w:t>Build payer-specific sub-models for the highest-volume payers.</w:t>
-      </w:r>
-    </w:p>
     <w:p/>
     <w:p>
       <w:pPr>

</xml_diff>